<commit_message>
Annotation (madetta): Classify 150 tweets pairs [0:150], and updated Victor annotation files
</commit_message>
<xml_diff>
--- a/data/Etapa 3 - Anotações explorativas/Controle_de_anotações_3.docx
+++ b/data/Etapa 3 - Anotações explorativas/Controle_de_anotações_3.docx
@@ -1134,7 +1134,7 @@
               <w:rPr>
                 <w:rtl w:val="0"/>
               </w:rPr>
-              <w:t xml:space="preserve">0</w:t>
+              <w:t xml:space="preserve">150</w:t>
             </w:r>
           </w:p>
         </w:tc>
@@ -1628,7 +1628,7 @@
               <w:rPr>
                 <w:rtl w:val="0"/>
               </w:rPr>
-              <w:t xml:space="preserve">0</w:t>
+              <w:t xml:space="preserve">150</w:t>
             </w:r>
           </w:p>
         </w:tc>
@@ -1681,7 +1681,7 @@
               <w:rPr>
                 <w:rtl w:val="0"/>
               </w:rPr>
-              <w:t xml:space="preserve">0</w:t>
+              <w:t xml:space="preserve">150</w:t>
             </w:r>
           </w:p>
         </w:tc>
@@ -2185,7 +2185,7 @@
               <w:rPr>
                 <w:rtl w:val="0"/>
               </w:rPr>
-              <w:t xml:space="preserve">0</w:t>
+              <w:t xml:space="preserve">150</w:t>
             </w:r>
           </w:p>
         </w:tc>

</xml_diff>